<commit_message>
Fixed typo in DLG Experience
</commit_message>
<xml_diff>
--- a/WilliamHolt_CV.docx
+++ b/WilliamHolt_CV.docx
@@ -679,7 +679,7 @@
           <w:vertAlign w:val="baseline"/>
           <w:rtl w:val="0"/>
         </w:rPr>
-        <w:t xml:space="preserve">L migration of Qlik dashboards to Tableau by documenting existing logic, enabling a streamlined and consistent transition process.</w:t>
+        <w:t xml:space="preserve"> migration of Qlik dashboards to Tableau by documenting existing logic, enabling a streamlined and consistent transition process.</w:t>
       </w:r>
       <w:r>
         <w:rPr>
@@ -1711,6 +1711,20 @@
       <w:shd w:fill="auto" w:val="clear"/>
       <w:vertAlign w:val="baseline"/>
     </w:rPr>
+  </w:style>
+  <w:style w:type="table" w:styleId="TableNormal" w:default="1">
+    <w:name w:val="TableNormal"/>
+    <w:tblPr>
+      <w:tblCellMar>
+        <w:top w:w="100.0" w:type="dxa"/>
+        <w:left w:w="100.0" w:type="dxa"/>
+        <w:bottom w:w="100.0" w:type="dxa"/>
+        <w:right w:w="100.0" w:type="dxa"/>
+      </w:tblCellMar>
+    </w:tblPr>
+  </w:style>
+  <w:style w:type="paragraph" w:styleId="Normal" w:default="1">
+    <w:name w:val="normal"/>
   </w:style>
   <w:style w:type="table" w:styleId="TableNormal" w:default="1">
     <w:name w:val="TableNormal"/>

</xml_diff>

<commit_message>
Fixed typo in docx document
</commit_message>
<xml_diff>
--- a/WilliamHolt_CV.docx
+++ b/WilliamHolt_CV.docx
@@ -662,6 +662,12 @@
         <w:jc w:val="left"/>
         <w:rPr/>
       </w:pPr>
+      <w:r>
+        <w:rPr>
+          <w:rtl w:val="0"/>
+        </w:rPr>
+        <w:t xml:space="preserve">Participated in</w:t>
+      </w:r>
       <w:r>
         <w:rPr>
           <w:rFonts w:ascii="Arial" w:cs="Arial" w:eastAsia="Arial" w:hAnsi="Arial"/>

</xml_diff>